<commit_message>
Entregables al dia, desde el commit 693f4f9 del repositorio de trabajo
</commit_message>
<xml_diff>
--- a/ENTREGA FINAL/04 - Manuales/1 - Manual de instalación.docx
+++ b/ENTREGA FINAL/04 - Manuales/1 - Manual de instalación.docx
@@ -239,7 +239,7 @@
           <w:color w:val="666666"/>
           <w:sz w:val="20"/>
         </w:rPr>
-        <w:t>Versión 1.0 · 16/09/2026</w:t>
+        <w:t>Versión 1.0 · 17/09/2026</w:t>
       </w:r>
     </w:p>
     <w:p>
@@ -309,7 +309,7 @@
         <w:rPr>
           <w:b/>
         </w:rPr>
-        <w:t>16/09/2026</w:t>
+        <w:t>17/09/2026</w:t>
       </w:r>
       <w:r>
         <w:t>, que es la que se entrega con el Trabajo Final. Documenta lo que el sistema hace hoy, no lo que va a hacer: si una pantalla no aparece acá, es porque todavía no existe.</w:t>

</xml_diff>